<commit_message>
update confusion matrix, ROC curve
</commit_message>
<xml_diff>
--- a/Result/Insights.docx
+++ b/Result/Insights.docx
@@ -40,7 +40,23 @@
         </w:numPr>
       </w:pPr>
       <w:r>
-        <w:t>Dataset &amp; DataLoader — custom FlightDataset with temporal augmentations (training only), mask computation for variable-length flights</w:t>
+        <w:t xml:space="preserve">Dataset &amp; </w:t>
+      </w:r>
+      <w:proofErr w:type="spellStart"/>
+      <w:r>
+        <w:t>DataLoader</w:t>
+      </w:r>
+      <w:proofErr w:type="spellEnd"/>
+      <w:r>
+        <w:t xml:space="preserve"> — custom </w:t>
+      </w:r>
+      <w:proofErr w:type="spellStart"/>
+      <w:r>
+        <w:t>FlightDataset</w:t>
+      </w:r>
+      <w:proofErr w:type="spellEnd"/>
+      <w:r>
+        <w:t xml:space="preserve"> with temporal augmentations (training only), mask computation for variable-length flights</w:t>
       </w:r>
     </w:p>
     <w:p>
@@ -51,7 +67,15 @@
         </w:numPr>
       </w:pPr>
       <w:r>
-        <w:t>Model Definition — TimeSeriesTransformer with conv front-end + Transformer encoder</w:t>
+        <w:t xml:space="preserve">Model Definition — </w:t>
+      </w:r>
+      <w:proofErr w:type="spellStart"/>
+      <w:r>
+        <w:t>TimeSeriesTransformer</w:t>
+      </w:r>
+      <w:proofErr w:type="spellEnd"/>
+      <w:r>
+        <w:t xml:space="preserve"> with conv front-end + Transformer encoder</w:t>
       </w:r>
     </w:p>
     <w:p>
@@ -62,7 +86,31 @@
         </w:numPr>
       </w:pPr>
       <w:r>
-        <w:t>Training Setup — AdamW optimizer, weighted CrossEntropyLoss, CosineAnnealingLR scheduler</w:t>
+        <w:t xml:space="preserve">Training Setup — </w:t>
+      </w:r>
+      <w:proofErr w:type="spellStart"/>
+      <w:r>
+        <w:t>AdamW</w:t>
+      </w:r>
+      <w:proofErr w:type="spellEnd"/>
+      <w:r>
+        <w:t xml:space="preserve"> optimizer, weighted </w:t>
+      </w:r>
+      <w:proofErr w:type="spellStart"/>
+      <w:r>
+        <w:t>CrossEntropyLoss</w:t>
+      </w:r>
+      <w:proofErr w:type="spellEnd"/>
+      <w:r>
+        <w:t xml:space="preserve">, </w:t>
+      </w:r>
+      <w:proofErr w:type="spellStart"/>
+      <w:r>
+        <w:t>CosineAnnealingLR</w:t>
+      </w:r>
+      <w:proofErr w:type="spellEnd"/>
+      <w:r>
+        <w:t xml:space="preserve"> scheduler</w:t>
       </w:r>
     </w:p>
     <w:p>
@@ -73,7 +121,15 @@
         </w:numPr>
       </w:pPr>
       <w:r>
-        <w:t>Training Loop — PR-AUC checkpoint selection, gradient clipping, tqdm progress bars</w:t>
+        <w:t xml:space="preserve">Training Loop — PR-AUC checkpoint selection, gradient clipping, </w:t>
+      </w:r>
+      <w:proofErr w:type="spellStart"/>
+      <w:r>
+        <w:t>tqdm</w:t>
+      </w:r>
+      <w:proofErr w:type="spellEnd"/>
+      <w:r>
+        <w:t xml:space="preserve"> progress bars</w:t>
       </w:r>
     </w:p>
     <w:p>
@@ -181,7 +237,15 @@
     </w:p>
     <w:p>
       <w:r>
-        <w:t>Experiments 1–2 diagnosed the core problem: LR=1e-3 caused majority-class collapse (the model predicted everything as "at risk," achieving RecallFail=1.0 but useless F1=0.35). Dropping to LR=3e-5 broke the collapse but was too conservative for the small dataset (PR-AUC=0.57). Experiment 3 found the sweet spot at LR=1e-4 with slight dropout increase (PR-</w:t>
+        <w:t xml:space="preserve">Experiments 1–2 diagnosed the core problem: LR=1e-3 caused majority-class collapse (the model predicted everything as "at risk," achieving </w:t>
+      </w:r>
+      <w:proofErr w:type="spellStart"/>
+      <w:r>
+        <w:t>RecallFail</w:t>
+      </w:r>
+      <w:proofErr w:type="spellEnd"/>
+      <w:r>
+        <w:t>=1.0 but useless F1=0.35). Dropping to LR=3e-5 broke the collapse but was too conservative for the small dataset (PR-AUC=0.57). Experiment 3 found the sweet spot at LR=1e-4 with slight dropout increase (PR-</w:t>
       </w:r>
       <w:r>
         <w:lastRenderedPageBreak/>
@@ -280,7 +344,15 @@
         </w:numPr>
       </w:pPr>
       <w:r>
-        <w:t>The 5-day prediction horizon offers the best operational trade-off: F1=0.739 with RecallFail=0.767 means the system catches 77% of at-risk flights while maintaining reasonable precision. The marginal improvement from 5d to 10d is small, suggesting most degradation signals emerge within 5 days.</w:t>
+        <w:t xml:space="preserve">The 5-day prediction horizon offers the best operational trade-off: F1=0.739 with </w:t>
+      </w:r>
+      <w:proofErr w:type="spellStart"/>
+      <w:r>
+        <w:t>RecallFail</w:t>
+      </w:r>
+      <w:proofErr w:type="spellEnd"/>
+      <w:r>
+        <w:t>=0.767 means the system catches 77% of at-risk flights while maintaining reasonable precision. The marginal improvement from 5d to 10d is small, suggesting most degradation signals emerge within 5 days.</w:t>
       </w:r>
     </w:p>
     <w:p/>
@@ -326,7 +398,15 @@
         <w:t>3. F1 and Recall improve dramatically from rul_2d to rul_5d, then plateau.</w:t>
       </w:r>
       <w:r>
-        <w:t xml:space="preserve"> The jump from F1=0.679 to 0.739 (rul_2d → rul_5d) is much larger than 0.739 to 0.746 (rul_5d → rul_10d). This suggests that most of the detectable degradation signal appears within 5 days of maintenance — extending to 10 days adds marginal information.</w:t>
+        <w:t xml:space="preserve"> The jump from F1=0.679 to 0.739 (rul_2d → rul_5d) is much larger than 0.739 to 0.746 (rul_5d → rul_10d). This suggests that most of the detectable degradation signal appears within 5 days of maintenance — extending to 10 </w:t>
+      </w:r>
+      <w:proofErr w:type="gramStart"/>
+      <w:r>
+        <w:t>days</w:t>
+      </w:r>
+      <w:proofErr w:type="gramEnd"/>
+      <w:r>
+        <w:t xml:space="preserve"> adds marginal information.</w:t>
       </w:r>
     </w:p>
     <w:p>
@@ -343,10 +423,10 @@
           <w:noProof/>
         </w:rPr>
         <w:drawing>
-          <wp:inline distT="0" distB="0" distL="0" distR="0" wp14:anchorId="65445E47" wp14:editId="0AE1B5D8">
-            <wp:extent cx="4933950" cy="3533775"/>
-            <wp:effectExtent l="0" t="0" r="0" b="9525"/>
-            <wp:docPr id="1965022436" name="Picture 1"/>
+          <wp:inline distT="0" distB="0" distL="0" distR="0" wp14:anchorId="71D0F8AD" wp14:editId="78E1014D">
+            <wp:extent cx="4924425" cy="3438525"/>
+            <wp:effectExtent l="0" t="0" r="9525" b="9525"/>
+            <wp:docPr id="882988423" name="Picture 1"/>
             <wp:cNvGraphicFramePr>
               <a:graphicFrameLocks xmlns:a="http://schemas.openxmlformats.org/drawingml/2006/main" noChangeAspect="1"/>
             </wp:cNvGraphicFramePr>
@@ -354,7 +434,7 @@
               <a:graphicData uri="http://schemas.openxmlformats.org/drawingml/2006/picture">
                 <pic:pic xmlns:pic="http://schemas.openxmlformats.org/drawingml/2006/picture">
                   <pic:nvPicPr>
-                    <pic:cNvPr id="1965022436" name=""/>
+                    <pic:cNvPr id="882988423" name=""/>
                     <pic:cNvPicPr/>
                   </pic:nvPicPr>
                   <pic:blipFill>
@@ -366,7 +446,7 @@
                   <pic:spPr>
                     <a:xfrm>
                       <a:off x="0" y="0"/>
-                      <a:ext cx="4933950" cy="3533775"/>
+                      <a:ext cx="4924425" cy="3438525"/>
                     </a:xfrm>
                     <a:prstGeom prst="rect">
                       <a:avLst/>
@@ -383,9 +463,11 @@
       <w:pPr>
         <w:pStyle w:val="Heading2"/>
       </w:pPr>
+      <w:proofErr w:type="spellStart"/>
       <w:r>
         <w:t>Optuna</w:t>
       </w:r>
+      <w:proofErr w:type="spellEnd"/>
     </w:p>
     <w:p>
       <w:pPr>
@@ -395,12 +477,21 @@
           <w:numId w:val="4"/>
         </w:numPr>
       </w:pPr>
+      <w:proofErr w:type="gramStart"/>
       <w:r>
         <w:rPr>
           <w:b/>
           <w:bCs/>
         </w:rPr>
-        <w:t>Warm-start / seeding</w:t>
+        <w:t>Warm-start</w:t>
+      </w:r>
+      <w:proofErr w:type="gramEnd"/>
+      <w:r>
+        <w:rPr>
+          <w:b/>
+          <w:bCs/>
+        </w:rPr>
+        <w:t xml:space="preserve"> / seeding</w:t>
       </w:r>
       <w:r>
         <w:t xml:space="preserve">: Injected best manual experiment parameters as </w:t>
@@ -413,7 +504,36 @@
         <w:t>Trial 0</w:t>
       </w:r>
       <w:r>
-        <w:t xml:space="preserve"> using study.enqueue_trial(), so Optuna starts from a proven baseline instead of random guessing </w:t>
+        <w:t xml:space="preserve"> using </w:t>
+      </w:r>
+      <w:proofErr w:type="spellStart"/>
+      <w:proofErr w:type="gramStart"/>
+      <w:r>
+        <w:t>study.enqueue</w:t>
+      </w:r>
+      <w:proofErr w:type="gramEnd"/>
+      <w:r>
+        <w:t>_</w:t>
+      </w:r>
+      <w:proofErr w:type="gramStart"/>
+      <w:r>
+        <w:t>trial</w:t>
+      </w:r>
+      <w:proofErr w:type="spellEnd"/>
+      <w:r>
+        <w:t>(</w:t>
+      </w:r>
+      <w:proofErr w:type="gramEnd"/>
+      <w:r>
+        <w:t xml:space="preserve">), so </w:t>
+      </w:r>
+      <w:proofErr w:type="spellStart"/>
+      <w:r>
+        <w:t>Optuna</w:t>
+      </w:r>
+      <w:proofErr w:type="spellEnd"/>
+      <w:r>
+        <w:t xml:space="preserve"> starts from a proven baseline instead of random guessing </w:t>
       </w:r>
     </w:p>
     <w:p>
@@ -463,6 +583,7 @@
           <w:numId w:val="4"/>
         </w:numPr>
       </w:pPr>
+      <w:proofErr w:type="spellStart"/>
       <w:r>
         <w:rPr>
           <w:b/>
@@ -471,6 +592,7 @@
         <w:lastRenderedPageBreak/>
         <w:t>HyperbandPruner</w:t>
       </w:r>
+      <w:proofErr w:type="spellEnd"/>
       <w:r>
         <w:t xml:space="preserve">: Used </w:t>
       </w:r>
@@ -499,10 +621,10 @@
           <w:noProof/>
         </w:rPr>
         <w:drawing>
-          <wp:inline distT="0" distB="0" distL="0" distR="0" wp14:anchorId="47ACF684" wp14:editId="542C361B">
-            <wp:extent cx="5943600" cy="1231265"/>
-            <wp:effectExtent l="0" t="0" r="0" b="6985"/>
-            <wp:docPr id="1306934382" name="Picture 1"/>
+          <wp:inline distT="0" distB="0" distL="0" distR="0" wp14:anchorId="27366920" wp14:editId="64FD9359">
+            <wp:extent cx="5943600" cy="1558290"/>
+            <wp:effectExtent l="0" t="0" r="0" b="3810"/>
+            <wp:docPr id="52825070" name="Picture 1"/>
             <wp:cNvGraphicFramePr>
               <a:graphicFrameLocks xmlns:a="http://schemas.openxmlformats.org/drawingml/2006/main" noChangeAspect="1"/>
             </wp:cNvGraphicFramePr>
@@ -510,7 +632,7 @@
               <a:graphicData uri="http://schemas.openxmlformats.org/drawingml/2006/picture">
                 <pic:pic xmlns:pic="http://schemas.openxmlformats.org/drawingml/2006/picture">
                   <pic:nvPicPr>
-                    <pic:cNvPr id="1306934382" name=""/>
+                    <pic:cNvPr id="52825070" name=""/>
                     <pic:cNvPicPr/>
                   </pic:nvPicPr>
                   <pic:blipFill>
@@ -522,7 +644,7 @@
                   <pic:spPr>
                     <a:xfrm>
                       <a:off x="0" y="0"/>
-                      <a:ext cx="5943600" cy="1231265"/>
+                      <a:ext cx="5943600" cy="1558290"/>
                     </a:xfrm>
                     <a:prstGeom prst="rect">
                       <a:avLst/>
@@ -541,10 +663,22 @@
           <w:b/>
           <w:bCs/>
         </w:rPr>
-        <w:t>Best F1 (threshold = 0.10)</w:t>
-      </w:r>
-      <w:r>
-        <w:t xml:space="preserve"> — Balanced mode</w:t>
+        <w:t xml:space="preserve">Best F1 (threshold = </w:t>
+      </w:r>
+      <w:proofErr w:type="gramStart"/>
+      <w:r>
+        <w:rPr>
+          <w:b/>
+          <w:bCs/>
+        </w:rPr>
+        <w:t>0.10)</w:t>
+      </w:r>
+      <w:r>
+        <w:t xml:space="preserve"> —</w:t>
+      </w:r>
+      <w:proofErr w:type="gramEnd"/>
+      <w:r>
+        <w:t xml:space="preserve"> Balanced mode</w:t>
       </w:r>
     </w:p>
     <w:p>
@@ -578,15 +712,35 @@
           <w:b/>
           <w:bCs/>
         </w:rPr>
-        <w:t>75% Recall (threshold = 0.06)</w:t>
-      </w:r>
-      <w:r>
-        <w:t xml:space="preserve"> — Safety-prioritized mode</w:t>
+        <w:t xml:space="preserve">75% Recall (threshold = </w:t>
+      </w:r>
+      <w:proofErr w:type="gramStart"/>
+      <w:r>
+        <w:rPr>
+          <w:b/>
+          <w:bCs/>
+        </w:rPr>
+        <w:t>0.06)</w:t>
+      </w:r>
+      <w:r>
+        <w:t xml:space="preserve"> —</w:t>
+      </w:r>
+      <w:proofErr w:type="gramEnd"/>
+      <w:r>
+        <w:t xml:space="preserve"> Safety-prioritized mode</w:t>
       </w:r>
     </w:p>
     <w:p>
       <w:r>
-        <w:t xml:space="preserve">Lowering the threshold to 6% means the model is more aggressive at flagging — it catches </w:t>
+        <w:t xml:space="preserve">Lowering the threshold to 6% means the model is more aggressive at </w:t>
+      </w:r>
+      <w:proofErr w:type="gramStart"/>
+      <w:r>
+        <w:t>flagging — it</w:t>
+      </w:r>
+      <w:proofErr w:type="gramEnd"/>
+      <w:r>
+        <w:t xml:space="preserve"> catches </w:t>
       </w:r>
       <w:r>
         <w:rPr>
@@ -596,7 +750,15 @@
         <w:t>76% of at-risk flights</w:t>
       </w:r>
       <w:r>
-        <w:t xml:space="preserve"> but precision drops to 58%, with 42 false alarms per 100 flags. You catch more dangerous flights but maintenance crews inspect more unnecessarily.</w:t>
+        <w:t xml:space="preserve"> but precision drops to 58%, with 42 false alarms per 100 flags. You catch more dangerous </w:t>
+      </w:r>
+      <w:proofErr w:type="gramStart"/>
+      <w:r>
+        <w:t>flights</w:t>
+      </w:r>
+      <w:proofErr w:type="gramEnd"/>
+      <w:r>
+        <w:t xml:space="preserve"> but maintenance crews inspect more unnecessarily.</w:t>
       </w:r>
     </w:p>
     <w:p>
@@ -605,15 +767,35 @@
           <w:b/>
           <w:bCs/>
         </w:rPr>
-        <w:t>90% Recall (threshold = 0.02)</w:t>
-      </w:r>
-      <w:r>
-        <w:t xml:space="preserve"> — Maximum safety mode</w:t>
+        <w:t xml:space="preserve">90% Recall (threshold = </w:t>
+      </w:r>
+      <w:proofErr w:type="gramStart"/>
+      <w:r>
+        <w:rPr>
+          <w:b/>
+          <w:bCs/>
+        </w:rPr>
+        <w:t>0.02)</w:t>
+      </w:r>
+      <w:r>
+        <w:t xml:space="preserve"> —</w:t>
+      </w:r>
+      <w:proofErr w:type="gramEnd"/>
+      <w:r>
+        <w:t xml:space="preserve"> Maximum safety mode</w:t>
       </w:r>
     </w:p>
     <w:p>
       <w:r>
-        <w:t xml:space="preserve">At just 2% threshold, the model flags almost everything suspicious — catching </w:t>
+        <w:t xml:space="preserve">At just 2% threshold, the model flags almost everything </w:t>
+      </w:r>
+      <w:proofErr w:type="gramStart"/>
+      <w:r>
+        <w:t>suspicious —</w:t>
+      </w:r>
+      <w:proofErr w:type="gramEnd"/>
+      <w:r>
+        <w:t xml:space="preserve"> catching </w:t>
       </w:r>
       <w:r>
         <w:rPr>
@@ -684,8 +866,17 @@
           <w:b/>
           <w:bCs/>
         </w:rPr>
-        <w:t>Ensemble of Transformer + InceptionTime</w:t>
-      </w:r>
+        <w:t xml:space="preserve">Ensemble of Transformer + </w:t>
+      </w:r>
+      <w:proofErr w:type="spellStart"/>
+      <w:r>
+        <w:rPr>
+          <w:b/>
+          <w:bCs/>
+        </w:rPr>
+        <w:t>InceptionTime</w:t>
+      </w:r>
+      <w:proofErr w:type="spellEnd"/>
       <w:r>
         <w:t xml:space="preserve"> — Since the two architectures capture different patterns (global attention vs local convolutions), a simple probability averaging ensemble could outperform both individual models.</w:t>
       </w:r>
@@ -960,12 +1151,37 @@
             <w:hideMark/>
           </w:tcPr>
           <w:p>
-            <w:r>
-              <w:rPr>
-                <w:sz w:val="17"/>
-                <w:szCs w:val="17"/>
-              </w:rPr>
-              <w:t>sequences.npy (19,540 x 9,212 x 15), labels.csv, seq_indices.npy from feature engineering pipeline</w:t>
+            <w:proofErr w:type="spellStart"/>
+            <w:r>
+              <w:rPr>
+                <w:sz w:val="17"/>
+                <w:szCs w:val="17"/>
+              </w:rPr>
+              <w:t>sequences.npy</w:t>
+            </w:r>
+            <w:proofErr w:type="spellEnd"/>
+            <w:r>
+              <w:rPr>
+                <w:sz w:val="17"/>
+                <w:szCs w:val="17"/>
+              </w:rPr>
+              <w:t xml:space="preserve"> (19,540 x 9,212 x 15), labels.csv, </w:t>
+            </w:r>
+            <w:proofErr w:type="spellStart"/>
+            <w:r>
+              <w:rPr>
+                <w:sz w:val="17"/>
+                <w:szCs w:val="17"/>
+              </w:rPr>
+              <w:t>seq_indices.npy</w:t>
+            </w:r>
+            <w:proofErr w:type="spellEnd"/>
+            <w:r>
+              <w:rPr>
+                <w:sz w:val="17"/>
+                <w:szCs w:val="17"/>
+              </w:rPr>
+              <w:t xml:space="preserve"> from feature engineering pipeline</w:t>
             </w:r>
           </w:p>
         </w:tc>
@@ -1045,12 +1261,39 @@
             <w:hideMark/>
           </w:tcPr>
           <w:p>
-            <w:r>
-              <w:rPr>
-                <w:sz w:val="17"/>
-                <w:szCs w:val="17"/>
-              </w:rPr>
-              <w:t>np.load(mmap_mode='r') - memory-mapped NumPy</w:t>
+            <w:proofErr w:type="spellStart"/>
+            <w:proofErr w:type="gramStart"/>
+            <w:r>
+              <w:rPr>
+                <w:sz w:val="17"/>
+                <w:szCs w:val="17"/>
+              </w:rPr>
+              <w:t>np.load</w:t>
+            </w:r>
+            <w:proofErr w:type="spellEnd"/>
+            <w:proofErr w:type="gramEnd"/>
+            <w:r>
+              <w:rPr>
+                <w:sz w:val="17"/>
+                <w:szCs w:val="17"/>
+              </w:rPr>
+              <w:t>(</w:t>
+            </w:r>
+            <w:proofErr w:type="spellStart"/>
+            <w:r>
+              <w:rPr>
+                <w:sz w:val="17"/>
+                <w:szCs w:val="17"/>
+              </w:rPr>
+              <w:t>mmap_mode</w:t>
+            </w:r>
+            <w:proofErr w:type="spellEnd"/>
+            <w:r>
+              <w:rPr>
+                <w:sz w:val="17"/>
+                <w:szCs w:val="17"/>
+              </w:rPr>
+              <w:t>='r') - memory-mapped NumPy</w:t>
             </w:r>
           </w:p>
         </w:tc>
@@ -1073,12 +1316,21 @@
             <w:hideMark/>
           </w:tcPr>
           <w:p>
-            <w:r>
-              <w:rPr>
-                <w:sz w:val="17"/>
-                <w:szCs w:val="17"/>
-              </w:rPr>
-              <w:t>Avoids loading full 5.4 GB array into RAM; pages in only the batches needed</w:t>
+            <w:proofErr w:type="gramStart"/>
+            <w:r>
+              <w:rPr>
+                <w:sz w:val="17"/>
+                <w:szCs w:val="17"/>
+              </w:rPr>
+              <w:t>Avoids</w:t>
+            </w:r>
+            <w:proofErr w:type="gramEnd"/>
+            <w:r>
+              <w:rPr>
+                <w:sz w:val="17"/>
+                <w:szCs w:val="17"/>
+              </w:rPr>
+              <w:t xml:space="preserve"> loading full 5.4 GB array into RAM; pages in only the batches needed</w:t>
             </w:r>
           </w:p>
         </w:tc>
@@ -1248,7 +1500,23 @@
                 <w:sz w:val="17"/>
                 <w:szCs w:val="17"/>
               </w:rPr>
-              <w:t>Fast hyperparameter screening (~5 min/epoch vs ~6.5 hrs/epoch on full data)</w:t>
+              <w:t xml:space="preserve">Fast hyperparameter screening (~5 min/epoch vs ~6.5 </w:t>
+            </w:r>
+            <w:proofErr w:type="spellStart"/>
+            <w:r>
+              <w:rPr>
+                <w:sz w:val="17"/>
+                <w:szCs w:val="17"/>
+              </w:rPr>
+              <w:t>hrs</w:t>
+            </w:r>
+            <w:proofErr w:type="spellEnd"/>
+            <w:r>
+              <w:rPr>
+                <w:sz w:val="17"/>
+                <w:szCs w:val="17"/>
+              </w:rPr>
+              <w:t>/epoch on full data)</w:t>
             </w:r>
           </w:p>
         </w:tc>
@@ -1447,7 +1715,23 @@
                 <w:sz w:val="17"/>
                 <w:szCs w:val="17"/>
               </w:rPr>
-              <w:t>Pre-computed split array from feature engineering pipeline (approx 70/15/15)</w:t>
+              <w:t>Pre-computed split array from feature engineering pipeline (</w:t>
+            </w:r>
+            <w:proofErr w:type="spellStart"/>
+            <w:r>
+              <w:rPr>
+                <w:sz w:val="17"/>
+                <w:szCs w:val="17"/>
+              </w:rPr>
+              <w:t>approx</w:t>
+            </w:r>
+            <w:proofErr w:type="spellEnd"/>
+            <w:r>
+              <w:rPr>
+                <w:sz w:val="17"/>
+                <w:szCs w:val="17"/>
+              </w:rPr>
+              <w:t xml:space="preserve"> 70/15/15)</w:t>
             </w:r>
           </w:p>
         </w:tc>
@@ -1527,13 +1811,49 @@
             <w:hideMark/>
           </w:tcPr>
           <w:p>
-            <w:r>
-              <w:rPr>
-                <w:sz w:val="17"/>
-                <w:szCs w:val="17"/>
-              </w:rPr>
-              <w:t>len(train) / (N_CLASSES x class_count) applied to nn.CrossEntropyLoss</w:t>
-            </w:r>
+            <w:proofErr w:type="spellStart"/>
+            <w:r>
+              <w:rPr>
+                <w:sz w:val="17"/>
+                <w:szCs w:val="17"/>
+              </w:rPr>
+              <w:t>len</w:t>
+            </w:r>
+            <w:proofErr w:type="spellEnd"/>
+            <w:r>
+              <w:rPr>
+                <w:sz w:val="17"/>
+                <w:szCs w:val="17"/>
+              </w:rPr>
+              <w:t xml:space="preserve">(train) / (N_CLASSES x </w:t>
+            </w:r>
+            <w:proofErr w:type="spellStart"/>
+            <w:r>
+              <w:rPr>
+                <w:sz w:val="17"/>
+                <w:szCs w:val="17"/>
+              </w:rPr>
+              <w:t>class_count</w:t>
+            </w:r>
+            <w:proofErr w:type="spellEnd"/>
+            <w:r>
+              <w:rPr>
+                <w:sz w:val="17"/>
+                <w:szCs w:val="17"/>
+              </w:rPr>
+              <w:t xml:space="preserve">) applied to </w:t>
+            </w:r>
+            <w:proofErr w:type="spellStart"/>
+            <w:proofErr w:type="gramStart"/>
+            <w:r>
+              <w:rPr>
+                <w:sz w:val="17"/>
+                <w:szCs w:val="17"/>
+              </w:rPr>
+              <w:t>nn.CrossEntropyLoss</w:t>
+            </w:r>
+            <w:proofErr w:type="spellEnd"/>
+            <w:proofErr w:type="gramEnd"/>
           </w:p>
         </w:tc>
         <w:tc>
@@ -1816,8 +2136,17 @@
                 <w:sz w:val="17"/>
                 <w:szCs w:val="17"/>
               </w:rPr>
-              <w:t>Temporal Cutmix</w:t>
-            </w:r>
+              <w:t xml:space="preserve">Temporal </w:t>
+            </w:r>
+            <w:proofErr w:type="spellStart"/>
+            <w:r>
+              <w:rPr>
+                <w:sz w:val="17"/>
+                <w:szCs w:val="17"/>
+              </w:rPr>
+              <w:t>Cutmix</w:t>
+            </w:r>
+            <w:proofErr w:type="spellEnd"/>
           </w:p>
         </w:tc>
         <w:tc>
@@ -1901,8 +2230,17 @@
                 <w:sz w:val="17"/>
                 <w:szCs w:val="17"/>
               </w:rPr>
-              <w:t>Temporal Mixup</w:t>
-            </w:r>
+              <w:t xml:space="preserve">Temporal </w:t>
+            </w:r>
+            <w:proofErr w:type="spellStart"/>
+            <w:r>
+              <w:rPr>
+                <w:sz w:val="17"/>
+                <w:szCs w:val="17"/>
+              </w:rPr>
+              <w:t>Mixup</w:t>
+            </w:r>
+            <w:proofErr w:type="spellEnd"/>
           </w:p>
         </w:tc>
         <w:tc>
@@ -2240,7 +2578,55 @@
                 <w:sz w:val="17"/>
                 <w:szCs w:val="17"/>
               </w:rPr>
-              <w:t>Two strided Conv1d layers (stride 2 + stride 4 = 8x downsampling) with BatchNorm + GELU + Dropout</w:t>
+              <w:t xml:space="preserve">Two </w:t>
+            </w:r>
+            <w:proofErr w:type="spellStart"/>
+            <w:r>
+              <w:rPr>
+                <w:sz w:val="17"/>
+                <w:szCs w:val="17"/>
+              </w:rPr>
+              <w:t>strided</w:t>
+            </w:r>
+            <w:proofErr w:type="spellEnd"/>
+            <w:r>
+              <w:rPr>
+                <w:sz w:val="17"/>
+                <w:szCs w:val="17"/>
+              </w:rPr>
+              <w:t xml:space="preserve"> Conv1d layers (stride 2 + stride 4 = 8x </w:t>
+            </w:r>
+            <w:proofErr w:type="spellStart"/>
+            <w:r>
+              <w:rPr>
+                <w:sz w:val="17"/>
+                <w:szCs w:val="17"/>
+              </w:rPr>
+              <w:t>downsampling</w:t>
+            </w:r>
+            <w:proofErr w:type="spellEnd"/>
+            <w:r>
+              <w:rPr>
+                <w:sz w:val="17"/>
+                <w:szCs w:val="17"/>
+              </w:rPr>
+              <w:t xml:space="preserve">) with </w:t>
+            </w:r>
+            <w:proofErr w:type="spellStart"/>
+            <w:r>
+              <w:rPr>
+                <w:sz w:val="17"/>
+                <w:szCs w:val="17"/>
+              </w:rPr>
+              <w:t>BatchNorm</w:t>
+            </w:r>
+            <w:proofErr w:type="spellEnd"/>
+            <w:r>
+              <w:rPr>
+                <w:sz w:val="17"/>
+                <w:szCs w:val="17"/>
+              </w:rPr>
+              <w:t xml:space="preserve"> + GELU + Dropout</w:t>
             </w:r>
           </w:p>
         </w:tc>
@@ -2325,7 +2711,41 @@
                 <w:sz w:val="17"/>
                 <w:szCs w:val="17"/>
               </w:rPr>
-              <w:t>Learnable nn.Parameter(1, 2000, d_model)</w:t>
+              <w:t xml:space="preserve">Learnable </w:t>
+            </w:r>
+            <w:proofErr w:type="spellStart"/>
+            <w:proofErr w:type="gramStart"/>
+            <w:r>
+              <w:rPr>
+                <w:sz w:val="17"/>
+                <w:szCs w:val="17"/>
+              </w:rPr>
+              <w:t>nn.Parameter</w:t>
+            </w:r>
+            <w:proofErr w:type="spellEnd"/>
+            <w:proofErr w:type="gramEnd"/>
+            <w:r>
+              <w:rPr>
+                <w:sz w:val="17"/>
+                <w:szCs w:val="17"/>
+              </w:rPr>
+              <w:t xml:space="preserve">(1, 2000, </w:t>
+            </w:r>
+            <w:proofErr w:type="spellStart"/>
+            <w:r>
+              <w:rPr>
+                <w:sz w:val="17"/>
+                <w:szCs w:val="17"/>
+              </w:rPr>
+              <w:t>d_model</w:t>
+            </w:r>
+            <w:proofErr w:type="spellEnd"/>
+            <w:r>
+              <w:rPr>
+                <w:sz w:val="17"/>
+                <w:szCs w:val="17"/>
+              </w:rPr>
+              <w:t>)</w:t>
             </w:r>
           </w:p>
         </w:tc>
@@ -2409,7 +2829,71 @@
                 <w:sz w:val="17"/>
                 <w:szCs w:val="17"/>
               </w:rPr>
-              <w:t>4 x TransformerEncoderLayer (d_model=256, 8 heads, dim_ff=1024, GELU, batch_first)</w:t>
+              <w:t xml:space="preserve">4 x </w:t>
+            </w:r>
+            <w:proofErr w:type="spellStart"/>
+            <w:r>
+              <w:rPr>
+                <w:sz w:val="17"/>
+                <w:szCs w:val="17"/>
+              </w:rPr>
+              <w:t>TransformerEncoderLayer</w:t>
+            </w:r>
+            <w:proofErr w:type="spellEnd"/>
+            <w:r>
+              <w:rPr>
+                <w:sz w:val="17"/>
+                <w:szCs w:val="17"/>
+              </w:rPr>
+              <w:t xml:space="preserve"> (</w:t>
+            </w:r>
+            <w:proofErr w:type="spellStart"/>
+            <w:r>
+              <w:rPr>
+                <w:sz w:val="17"/>
+                <w:szCs w:val="17"/>
+              </w:rPr>
+              <w:t>d_model</w:t>
+            </w:r>
+            <w:proofErr w:type="spellEnd"/>
+            <w:r>
+              <w:rPr>
+                <w:sz w:val="17"/>
+                <w:szCs w:val="17"/>
+              </w:rPr>
+              <w:t xml:space="preserve">=256, 8 heads, </w:t>
+            </w:r>
+            <w:proofErr w:type="spellStart"/>
+            <w:r>
+              <w:rPr>
+                <w:sz w:val="17"/>
+                <w:szCs w:val="17"/>
+              </w:rPr>
+              <w:t>dim_ff</w:t>
+            </w:r>
+            <w:proofErr w:type="spellEnd"/>
+            <w:r>
+              <w:rPr>
+                <w:sz w:val="17"/>
+                <w:szCs w:val="17"/>
+              </w:rPr>
+              <w:t xml:space="preserve">=1024, GELU, </w:t>
+            </w:r>
+            <w:proofErr w:type="spellStart"/>
+            <w:r>
+              <w:rPr>
+                <w:sz w:val="17"/>
+                <w:szCs w:val="17"/>
+              </w:rPr>
+              <w:t>batch_first</w:t>
+            </w:r>
+            <w:proofErr w:type="spellEnd"/>
+            <w:r>
+              <w:rPr>
+                <w:sz w:val="17"/>
+                <w:szCs w:val="17"/>
+              </w:rPr>
+              <w:t>)</w:t>
             </w:r>
           </w:p>
         </w:tc>
@@ -2490,12 +2974,62 @@
             <w:hideMark/>
           </w:tcPr>
           <w:p>
-            <w:r>
-              <w:rPr>
-                <w:sz w:val="17"/>
-                <w:szCs w:val="17"/>
-              </w:rPr>
-              <w:t>nn.functional.interpolate(mask, mode='nearest') to downsample mask to compressed length</w:t>
+            <w:proofErr w:type="spellStart"/>
+            <w:proofErr w:type="gramStart"/>
+            <w:r>
+              <w:rPr>
+                <w:sz w:val="17"/>
+                <w:szCs w:val="17"/>
+              </w:rPr>
+              <w:t>nn.functional</w:t>
+            </w:r>
+            <w:proofErr w:type="gramEnd"/>
+            <w:r>
+              <w:rPr>
+                <w:sz w:val="17"/>
+                <w:szCs w:val="17"/>
+              </w:rPr>
+              <w:t>.</w:t>
+            </w:r>
+            <w:proofErr w:type="gramStart"/>
+            <w:r>
+              <w:rPr>
+                <w:sz w:val="17"/>
+                <w:szCs w:val="17"/>
+              </w:rPr>
+              <w:t>interpolate</w:t>
+            </w:r>
+            <w:proofErr w:type="spellEnd"/>
+            <w:r>
+              <w:rPr>
+                <w:sz w:val="17"/>
+                <w:szCs w:val="17"/>
+              </w:rPr>
+              <w:t>(</w:t>
+            </w:r>
+            <w:proofErr w:type="gramEnd"/>
+            <w:r>
+              <w:rPr>
+                <w:sz w:val="17"/>
+                <w:szCs w:val="17"/>
+              </w:rPr>
+              <w:t xml:space="preserve">mask, mode='nearest') to </w:t>
+            </w:r>
+            <w:proofErr w:type="spellStart"/>
+            <w:r>
+              <w:rPr>
+                <w:sz w:val="17"/>
+                <w:szCs w:val="17"/>
+              </w:rPr>
+              <w:t>downsample</w:t>
+            </w:r>
+            <w:proofErr w:type="spellEnd"/>
+            <w:r>
+              <w:rPr>
+                <w:sz w:val="17"/>
+                <w:szCs w:val="17"/>
+              </w:rPr>
+              <w:t xml:space="preserve"> mask to compressed length</w:t>
             </w:r>
           </w:p>
         </w:tc>
@@ -2579,7 +3113,48 @@
                 <w:sz w:val="17"/>
                 <w:szCs w:val="17"/>
               </w:rPr>
-              <w:t>(x * mask).sum() / mask.sum() over time dimension</w:t>
+              <w:t>(x * mask</w:t>
+            </w:r>
+            <w:proofErr w:type="gramStart"/>
+            <w:r>
+              <w:rPr>
+                <w:sz w:val="17"/>
+                <w:szCs w:val="17"/>
+              </w:rPr>
+              <w:t>).sum</w:t>
+            </w:r>
+            <w:proofErr w:type="gramEnd"/>
+            <w:r>
+              <w:rPr>
+                <w:sz w:val="17"/>
+                <w:szCs w:val="17"/>
+              </w:rPr>
+              <w:t xml:space="preserve">() / </w:t>
+            </w:r>
+            <w:proofErr w:type="spellStart"/>
+            <w:proofErr w:type="gramStart"/>
+            <w:r>
+              <w:rPr>
+                <w:sz w:val="17"/>
+                <w:szCs w:val="17"/>
+              </w:rPr>
+              <w:t>mask.sum</w:t>
+            </w:r>
+            <w:proofErr w:type="spellEnd"/>
+            <w:r>
+              <w:rPr>
+                <w:sz w:val="17"/>
+                <w:szCs w:val="17"/>
+              </w:rPr>
+              <w:t>(</w:t>
+            </w:r>
+            <w:proofErr w:type="gramEnd"/>
+            <w:r>
+              <w:rPr>
+                <w:sz w:val="17"/>
+                <w:szCs w:val="17"/>
+              </w:rPr>
+              <w:t>) over time dimension</w:t>
             </w:r>
           </w:p>
         </w:tc>
@@ -2606,7 +3181,23 @@
                 <w:sz w:val="17"/>
                 <w:szCs w:val="17"/>
               </w:rPr>
-              <w:t>Averages only over real timesteps, not padding - critical for short flights with large padded regions</w:t>
+              <w:t xml:space="preserve">Averages only over real timesteps, not padding - critical for short flights with </w:t>
+            </w:r>
+            <w:proofErr w:type="gramStart"/>
+            <w:r>
+              <w:rPr>
+                <w:sz w:val="17"/>
+                <w:szCs w:val="17"/>
+              </w:rPr>
+              <w:t>large padded</w:t>
+            </w:r>
+            <w:proofErr w:type="gramEnd"/>
+            <w:r>
+              <w:rPr>
+                <w:sz w:val="17"/>
+                <w:szCs w:val="17"/>
+              </w:rPr>
+              <w:t xml:space="preserve"> regions</w:t>
             </w:r>
           </w:p>
         </w:tc>
@@ -2631,6 +3222,7 @@
             <w:hideMark/>
           </w:tcPr>
           <w:p>
+            <w:proofErr w:type="spellStart"/>
             <w:r>
               <w:rPr>
                 <w:sz w:val="17"/>
@@ -2638,6 +3230,7 @@
               </w:rPr>
               <w:t>LayerNorm</w:t>
             </w:r>
+            <w:proofErr w:type="spellEnd"/>
           </w:p>
         </w:tc>
         <w:tc>
@@ -2659,12 +3252,39 @@
             <w:hideMark/>
           </w:tcPr>
           <w:p>
-            <w:r>
-              <w:rPr>
-                <w:sz w:val="17"/>
-                <w:szCs w:val="17"/>
-              </w:rPr>
-              <w:t>nn.LayerNorm(d_model) before classifier</w:t>
+            <w:proofErr w:type="spellStart"/>
+            <w:proofErr w:type="gramStart"/>
+            <w:r>
+              <w:rPr>
+                <w:sz w:val="17"/>
+                <w:szCs w:val="17"/>
+              </w:rPr>
+              <w:t>nn.LayerNorm</w:t>
+            </w:r>
+            <w:proofErr w:type="spellEnd"/>
+            <w:proofErr w:type="gramEnd"/>
+            <w:r>
+              <w:rPr>
+                <w:sz w:val="17"/>
+                <w:szCs w:val="17"/>
+              </w:rPr>
+              <w:t>(</w:t>
+            </w:r>
+            <w:proofErr w:type="spellStart"/>
+            <w:r>
+              <w:rPr>
+                <w:sz w:val="17"/>
+                <w:szCs w:val="17"/>
+              </w:rPr>
+              <w:t>d_model</w:t>
+            </w:r>
+            <w:proofErr w:type="spellEnd"/>
+            <w:r>
+              <w:rPr>
+                <w:sz w:val="17"/>
+                <w:szCs w:val="17"/>
+              </w:rPr>
+              <w:t>) before classifier</w:t>
             </w:r>
           </w:p>
         </w:tc>
@@ -2743,12 +3363,39 @@
             <w:hideMark/>
           </w:tcPr>
           <w:p>
-            <w:r>
-              <w:rPr>
-                <w:sz w:val="17"/>
-                <w:szCs w:val="17"/>
-              </w:rPr>
-              <w:t>nn.Linear(d_model, 2)</w:t>
+            <w:proofErr w:type="spellStart"/>
+            <w:proofErr w:type="gramStart"/>
+            <w:r>
+              <w:rPr>
+                <w:sz w:val="17"/>
+                <w:szCs w:val="17"/>
+              </w:rPr>
+              <w:t>nn.Linear</w:t>
+            </w:r>
+            <w:proofErr w:type="spellEnd"/>
+            <w:proofErr w:type="gramEnd"/>
+            <w:r>
+              <w:rPr>
+                <w:sz w:val="17"/>
+                <w:szCs w:val="17"/>
+              </w:rPr>
+              <w:t>(</w:t>
+            </w:r>
+            <w:proofErr w:type="spellStart"/>
+            <w:r>
+              <w:rPr>
+                <w:sz w:val="17"/>
+                <w:szCs w:val="17"/>
+              </w:rPr>
+              <w:t>d_model</w:t>
+            </w:r>
+            <w:proofErr w:type="spellEnd"/>
+            <w:r>
+              <w:rPr>
+                <w:sz w:val="17"/>
+                <w:szCs w:val="17"/>
+              </w:rPr>
+              <w:t>, 2)</w:t>
             </w:r>
           </w:p>
         </w:tc>
@@ -2969,12 +3616,37 @@
             <w:hideMark/>
           </w:tcPr>
           <w:p>
-            <w:r>
-              <w:rPr>
-                <w:sz w:val="17"/>
-                <w:szCs w:val="17"/>
-              </w:rPr>
-              <w:t>AdamW with weight_decay=1e-4</w:t>
+            <w:proofErr w:type="spellStart"/>
+            <w:r>
+              <w:rPr>
+                <w:sz w:val="17"/>
+                <w:szCs w:val="17"/>
+              </w:rPr>
+              <w:t>AdamW</w:t>
+            </w:r>
+            <w:proofErr w:type="spellEnd"/>
+            <w:r>
+              <w:rPr>
+                <w:sz w:val="17"/>
+                <w:szCs w:val="17"/>
+              </w:rPr>
+              <w:t xml:space="preserve"> with </w:t>
+            </w:r>
+            <w:proofErr w:type="spellStart"/>
+            <w:r>
+              <w:rPr>
+                <w:sz w:val="17"/>
+                <w:szCs w:val="17"/>
+              </w:rPr>
+              <w:t>weight_decay</w:t>
+            </w:r>
+            <w:proofErr w:type="spellEnd"/>
+            <w:r>
+              <w:rPr>
+                <w:sz w:val="17"/>
+                <w:szCs w:val="17"/>
+              </w:rPr>
+              <w:t>=1e-4</w:t>
             </w:r>
           </w:p>
         </w:tc>
@@ -3138,12 +3810,37 @@
             <w:hideMark/>
           </w:tcPr>
           <w:p>
-            <w:r>
-              <w:rPr>
-                <w:sz w:val="17"/>
-                <w:szCs w:val="17"/>
-              </w:rPr>
-              <w:t>CosineAnnealingLR (T_max=N_EPOCHS, eta_min=1e-6), stepped per epoch</w:t>
+            <w:proofErr w:type="spellStart"/>
+            <w:r>
+              <w:rPr>
+                <w:sz w:val="17"/>
+                <w:szCs w:val="17"/>
+              </w:rPr>
+              <w:t>CosineAnnealingLR</w:t>
+            </w:r>
+            <w:proofErr w:type="spellEnd"/>
+            <w:r>
+              <w:rPr>
+                <w:sz w:val="17"/>
+                <w:szCs w:val="17"/>
+              </w:rPr>
+              <w:t xml:space="preserve"> (T_max=N_EPOCHS, </w:t>
+            </w:r>
+            <w:proofErr w:type="spellStart"/>
+            <w:r>
+              <w:rPr>
+                <w:sz w:val="17"/>
+                <w:szCs w:val="17"/>
+              </w:rPr>
+              <w:t>eta_min</w:t>
+            </w:r>
+            <w:proofErr w:type="spellEnd"/>
+            <w:r>
+              <w:rPr>
+                <w:sz w:val="17"/>
+                <w:szCs w:val="17"/>
+              </w:rPr>
+              <w:t>=1e-6), stepped per epoch</w:t>
             </w:r>
           </w:p>
         </w:tc>
@@ -3170,7 +3867,23 @@
                 <w:sz w:val="17"/>
                 <w:szCs w:val="17"/>
               </w:rPr>
-              <w:t>Smoothly decays LR following cosine curve - more stable than OneCycleLR for this task</w:t>
+              <w:t xml:space="preserve">Smoothly decays LR following cosine curve - more stable than </w:t>
+            </w:r>
+            <w:proofErr w:type="spellStart"/>
+            <w:r>
+              <w:rPr>
+                <w:sz w:val="17"/>
+                <w:szCs w:val="17"/>
+              </w:rPr>
+              <w:t>OneCycleLR</w:t>
+            </w:r>
+            <w:proofErr w:type="spellEnd"/>
+            <w:r>
+              <w:rPr>
+                <w:sz w:val="17"/>
+                <w:szCs w:val="17"/>
+              </w:rPr>
+              <w:t xml:space="preserve"> for this task</w:t>
             </w:r>
           </w:p>
         </w:tc>
@@ -3223,12 +3936,37 @@
             <w:hideMark/>
           </w:tcPr>
           <w:p>
-            <w:r>
-              <w:rPr>
-                <w:sz w:val="17"/>
-                <w:szCs w:val="17"/>
-              </w:rPr>
-              <w:t>clip_grad_norm_(max_norm=1.0)</w:t>
+            <w:proofErr w:type="spellStart"/>
+            <w:r>
+              <w:rPr>
+                <w:sz w:val="17"/>
+                <w:szCs w:val="17"/>
+              </w:rPr>
+              <w:t>clip_grad_norm</w:t>
+            </w:r>
+            <w:proofErr w:type="spellEnd"/>
+            <w:r>
+              <w:rPr>
+                <w:sz w:val="17"/>
+                <w:szCs w:val="17"/>
+              </w:rPr>
+              <w:t>_(</w:t>
+            </w:r>
+            <w:proofErr w:type="spellStart"/>
+            <w:r>
+              <w:rPr>
+                <w:sz w:val="17"/>
+                <w:szCs w:val="17"/>
+              </w:rPr>
+              <w:t>max_norm</w:t>
+            </w:r>
+            <w:proofErr w:type="spellEnd"/>
+            <w:r>
+              <w:rPr>
+                <w:sz w:val="17"/>
+                <w:szCs w:val="17"/>
+              </w:rPr>
+              <w:t>=1.0)</w:t>
             </w:r>
           </w:p>
         </w:tc>
@@ -3397,7 +4135,41 @@
                 <w:sz w:val="17"/>
                 <w:szCs w:val="17"/>
               </w:rPr>
-              <w:t>SEED=42 for numpy, torch, random; cudnn.deterministic=True</w:t>
+              <w:t xml:space="preserve">SEED=42 for </w:t>
+            </w:r>
+            <w:proofErr w:type="spellStart"/>
+            <w:r>
+              <w:rPr>
+                <w:sz w:val="17"/>
+                <w:szCs w:val="17"/>
+              </w:rPr>
+              <w:t>numpy</w:t>
+            </w:r>
+            <w:proofErr w:type="spellEnd"/>
+            <w:r>
+              <w:rPr>
+                <w:sz w:val="17"/>
+                <w:szCs w:val="17"/>
+              </w:rPr>
+              <w:t xml:space="preserve">, torch, random; </w:t>
+            </w:r>
+            <w:proofErr w:type="spellStart"/>
+            <w:proofErr w:type="gramStart"/>
+            <w:r>
+              <w:rPr>
+                <w:sz w:val="17"/>
+                <w:szCs w:val="17"/>
+              </w:rPr>
+              <w:t>cudnn.deterministic</w:t>
+            </w:r>
+            <w:proofErr w:type="spellEnd"/>
+            <w:proofErr w:type="gramEnd"/>
+            <w:r>
+              <w:rPr>
+                <w:sz w:val="17"/>
+                <w:szCs w:val="17"/>
+              </w:rPr>
+              <w:t>=True</w:t>
             </w:r>
           </w:p>
         </w:tc>
@@ -3737,7 +4509,23 @@
                 <w:sz w:val="17"/>
                 <w:szCs w:val="17"/>
               </w:rPr>
-              <w:t>Threshold-dependent metrics at default 0.5 - shows operational performance</w:t>
+              <w:t xml:space="preserve">Threshold-dependent metrics at default 0.5 - </w:t>
+            </w:r>
+            <w:proofErr w:type="gramStart"/>
+            <w:r>
+              <w:rPr>
+                <w:sz w:val="17"/>
+                <w:szCs w:val="17"/>
+              </w:rPr>
+              <w:t>shows</w:t>
+            </w:r>
+            <w:proofErr w:type="gramEnd"/>
+            <w:r>
+              <w:rPr>
+                <w:sz w:val="17"/>
+                <w:szCs w:val="17"/>
+              </w:rPr>
+              <w:t xml:space="preserve"> operational performance</w:t>
             </w:r>
           </w:p>
         </w:tc>
@@ -3820,7 +4608,23 @@
                 <w:sz w:val="17"/>
                 <w:szCs w:val="17"/>
               </w:rPr>
-              <w:t>Monitors overfitting (train-val gap) and training stability</w:t>
+              <w:t>Monitors overfitting (train-</w:t>
+            </w:r>
+            <w:proofErr w:type="spellStart"/>
+            <w:r>
+              <w:rPr>
+                <w:sz w:val="17"/>
+                <w:szCs w:val="17"/>
+              </w:rPr>
+              <w:t>val</w:t>
+            </w:r>
+            <w:proofErr w:type="spellEnd"/>
+            <w:r>
+              <w:rPr>
+                <w:sz w:val="17"/>
+                <w:szCs w:val="17"/>
+              </w:rPr>
+              <w:t xml:space="preserve"> gap) and training stability</w:t>
             </w:r>
           </w:p>
         </w:tc>
@@ -3879,8 +4683,17 @@
                 <w:sz w:val="17"/>
                 <w:szCs w:val="17"/>
               </w:rPr>
-              <w:t>Group false negatives by label_grouped</w:t>
-            </w:r>
+              <w:t xml:space="preserve">Group false negatives by </w:t>
+            </w:r>
+            <w:proofErr w:type="spellStart"/>
+            <w:r>
+              <w:rPr>
+                <w:sz w:val="17"/>
+                <w:szCs w:val="17"/>
+              </w:rPr>
+              <w:t>label_grouped</w:t>
+            </w:r>
+            <w:proofErr w:type="spellEnd"/>
           </w:p>
         </w:tc>
         <w:tc>
@@ -3907,7 +4720,23 @@
                 <w:sz w:val="17"/>
                 <w:szCs w:val="17"/>
               </w:rPr>
-              <w:t>Identifies which failure types the model systematically misses - critical for safety</w:t>
+              <w:t xml:space="preserve">Identifies which failure </w:t>
+            </w:r>
+            <w:proofErr w:type="gramStart"/>
+            <w:r>
+              <w:rPr>
+                <w:sz w:val="17"/>
+                <w:szCs w:val="17"/>
+              </w:rPr>
+              <w:t>types</w:t>
+            </w:r>
+            <w:proofErr w:type="gramEnd"/>
+            <w:r>
+              <w:rPr>
+                <w:sz w:val="17"/>
+                <w:szCs w:val="17"/>
+              </w:rPr>
+              <w:t xml:space="preserve"> the model systematically misses - critical for safety</w:t>
             </w:r>
           </w:p>
         </w:tc>
@@ -3936,7 +4765,23 @@
                 <w:sz w:val="17"/>
                 <w:szCs w:val="17"/>
               </w:rPr>
-              <w:t>Errors by flight length</w:t>
+              <w:t xml:space="preserve">Errors </w:t>
+            </w:r>
+            <w:proofErr w:type="gramStart"/>
+            <w:r>
+              <w:rPr>
+                <w:sz w:val="17"/>
+                <w:szCs w:val="17"/>
+              </w:rPr>
+              <w:t>by</w:t>
+            </w:r>
+            <w:proofErr w:type="gramEnd"/>
+            <w:r>
+              <w:rPr>
+                <w:sz w:val="17"/>
+                <w:szCs w:val="17"/>
+              </w:rPr>
+              <w:t xml:space="preserve"> flight length</w:t>
             </w:r>
           </w:p>
         </w:tc>
@@ -4127,13 +4972,31 @@
             <w:hideMark/>
           </w:tcPr>
           <w:p>
-            <w:r>
-              <w:rPr>
-                <w:sz w:val="17"/>
-                <w:szCs w:val="17"/>
-              </w:rPr>
-              <w:t>sklearn calibration_curve</w:t>
-            </w:r>
+            <w:proofErr w:type="spellStart"/>
+            <w:r>
+              <w:rPr>
+                <w:sz w:val="17"/>
+                <w:szCs w:val="17"/>
+              </w:rPr>
+              <w:t>sklearn</w:t>
+            </w:r>
+            <w:proofErr w:type="spellEnd"/>
+            <w:r>
+              <w:rPr>
+                <w:sz w:val="17"/>
+                <w:szCs w:val="17"/>
+              </w:rPr>
+              <w:t xml:space="preserve"> </w:t>
+            </w:r>
+            <w:proofErr w:type="spellStart"/>
+            <w:r>
+              <w:rPr>
+                <w:sz w:val="17"/>
+                <w:szCs w:val="17"/>
+              </w:rPr>
+              <w:t>calibration_curve</w:t>
+            </w:r>
+            <w:proofErr w:type="spellEnd"/>
           </w:p>
         </w:tc>
         <w:tc>
@@ -4154,12 +5017,37 @@
             <w:hideMark/>
           </w:tcPr>
           <w:p>
-            <w:r>
-              <w:rPr>
-                <w:sz w:val="17"/>
-                <w:szCs w:val="17"/>
-              </w:rPr>
-              <w:t>Checks if predicted probabilities match actual frequencies - important for deployment</w:t>
+            <w:proofErr w:type="gramStart"/>
+            <w:r>
+              <w:rPr>
+                <w:sz w:val="17"/>
+                <w:szCs w:val="17"/>
+              </w:rPr>
+              <w:t>Checks</w:t>
+            </w:r>
+            <w:proofErr w:type="gramEnd"/>
+            <w:r>
+              <w:rPr>
+                <w:sz w:val="17"/>
+                <w:szCs w:val="17"/>
+              </w:rPr>
+              <w:t xml:space="preserve"> </w:t>
+            </w:r>
+            <w:proofErr w:type="gramStart"/>
+            <w:r>
+              <w:rPr>
+                <w:sz w:val="17"/>
+                <w:szCs w:val="17"/>
+              </w:rPr>
+              <w:t>if</w:t>
+            </w:r>
+            <w:proofErr w:type="gramEnd"/>
+            <w:r>
+              <w:rPr>
+                <w:sz w:val="17"/>
+                <w:szCs w:val="17"/>
+              </w:rPr>
+              <w:t xml:space="preserve"> predicted probabilities match actual frequencies - important for deployment</w:t>
             </w:r>
           </w:p>
         </w:tc>
@@ -4328,7 +5216,23 @@
                 <w:sz w:val="17"/>
                 <w:szCs w:val="17"/>
               </w:rPr>
-              <w:t>Finds deployment-ready thresholds; matches InceptionTime format for comparison</w:t>
+              <w:t xml:space="preserve">Finds deployment-ready thresholds; matches </w:t>
+            </w:r>
+            <w:proofErr w:type="spellStart"/>
+            <w:r>
+              <w:rPr>
+                <w:sz w:val="17"/>
+                <w:szCs w:val="17"/>
+              </w:rPr>
+              <w:t>InceptionTime</w:t>
+            </w:r>
+            <w:proofErr w:type="spellEnd"/>
+            <w:r>
+              <w:rPr>
+                <w:sz w:val="17"/>
+                <w:szCs w:val="17"/>
+              </w:rPr>
+              <w:t xml:space="preserve"> format for comparison</w:t>
             </w:r>
           </w:p>
         </w:tc>
@@ -4612,7 +5516,25 @@
                 <w:sz w:val="17"/>
                 <w:szCs w:val="17"/>
               </w:rPr>
-              <w:t>best_model.pt, test_predictions.csv, config.json per target variable</w:t>
+              <w:t xml:space="preserve">best_model.pt, test_predictions.csv, </w:t>
+            </w:r>
+            <w:proofErr w:type="spellStart"/>
+            <w:proofErr w:type="gramStart"/>
+            <w:r>
+              <w:rPr>
+                <w:sz w:val="17"/>
+                <w:szCs w:val="17"/>
+              </w:rPr>
+              <w:t>config.json</w:t>
+            </w:r>
+            <w:proofErr w:type="spellEnd"/>
+            <w:proofErr w:type="gramEnd"/>
+            <w:r>
+              <w:rPr>
+                <w:sz w:val="17"/>
+                <w:szCs w:val="17"/>
+              </w:rPr>
+              <w:t xml:space="preserve"> per target variable</w:t>
             </w:r>
           </w:p>
         </w:tc>
@@ -4691,12 +5613,55 @@
             <w:hideMark/>
           </w:tcPr>
           <w:p>
-            <w:r>
-              <w:rPr>
-                <w:sz w:val="17"/>
-                <w:szCs w:val="17"/>
-              </w:rPr>
-              <w:t>shutil.move to transformer_artifacts_{TARGET_VARIABLE}/</w:t>
+            <w:proofErr w:type="spellStart"/>
+            <w:proofErr w:type="gramStart"/>
+            <w:r>
+              <w:rPr>
+                <w:sz w:val="17"/>
+                <w:szCs w:val="17"/>
+              </w:rPr>
+              <w:t>shutil.move</w:t>
+            </w:r>
+            <w:proofErr w:type="spellEnd"/>
+            <w:proofErr w:type="gramEnd"/>
+            <w:r>
+              <w:rPr>
+                <w:sz w:val="17"/>
+                <w:szCs w:val="17"/>
+              </w:rPr>
+              <w:t xml:space="preserve"> to </w:t>
+            </w:r>
+            <w:proofErr w:type="spellStart"/>
+            <w:r>
+              <w:rPr>
+                <w:sz w:val="17"/>
+                <w:szCs w:val="17"/>
+              </w:rPr>
+              <w:t>transformer_</w:t>
+            </w:r>
+            <w:proofErr w:type="gramStart"/>
+            <w:r>
+              <w:rPr>
+                <w:sz w:val="17"/>
+                <w:szCs w:val="17"/>
+              </w:rPr>
+              <w:t>artifacts</w:t>
+            </w:r>
+            <w:proofErr w:type="spellEnd"/>
+            <w:r>
+              <w:rPr>
+                <w:sz w:val="17"/>
+                <w:szCs w:val="17"/>
+              </w:rPr>
+              <w:t>_{</w:t>
+            </w:r>
+            <w:proofErr w:type="gramEnd"/>
+            <w:r>
+              <w:rPr>
+                <w:sz w:val="17"/>
+                <w:szCs w:val="17"/>
+              </w:rPr>
+              <w:t>TARGET_VARIABLE}/</w:t>
             </w:r>
           </w:p>
         </w:tc>

</xml_diff>